<commit_message>
word coument about 2020 missing analysis
</commit_message>
<xml_diff>
--- a/notebooks/2020_Birth/First Stage 2020/01_missing_values_analysis.docx
+++ b/notebooks/2020_Birth/First Stage 2020/01_missing_values_analysis.docx
@@ -13,7 +13,7 @@
     </w:p>
     <w:p>
       <w:r>
-        <w:t>Generated: 2026-03-22 07:28</w:t>
+        <w:t>Generated: 2026-03-29 08:53</w:t>
       </w:r>
     </w:p>
     <w:p>
@@ -36,13 +36,13 @@
         <w:br/>
         <w:t>Key findings include:</w:t>
         <w:br/>
-        <w:t>• Total missing values: 91,489 (1.68% of all data)</w:t>
+        <w:t>• Total missing values: 89,748 (1.65% of all data)</w:t>
         <w:br/>
-        <w:t>• Columns with missing data: 8 out of 18 columns</w:t>
+        <w:t>• Columns with missing data: 7 out of 18 columns</w:t>
         <w:br/>
         <w:t>• Columns with &gt;20% missing data: 0</w:t>
         <w:br/>
-        <w:t>• Best completed columns: ['Registered_Month2.0', 'Registered_Year', 'Hospital or Not']</w:t>
+        <w:t>• Best completed columns: ['Registered_Year', 'Registered_Month', 'Registered_District']</w:t>
       </w:r>
     </w:p>
     <w:p>
@@ -168,7 +168,7 @@
               <w:jc w:val="right"/>
             </w:pPr>
             <w:r>
-              <w:t>8.0</w:t>
+              <w:t>7.0</w:t>
             </w:r>
           </w:p>
         </w:tc>
@@ -193,7 +193,7 @@
               <w:jc w:val="right"/>
             </w:pPr>
             <w:r>
-              <w:t>91489.0</w:t>
+              <w:t>89748.0</w:t>
             </w:r>
           </w:p>
         </w:tc>
@@ -218,7 +218,7 @@
               <w:jc w:val="right"/>
             </w:pPr>
             <w:r>
-              <w:t>1.68</w:t>
+              <w:t>1.65</w:t>
             </w:r>
           </w:p>
         </w:tc>
@@ -461,7 +461,7 @@
           </w:tcPr>
           <w:p>
             <w:r>
-              <w:t>Birth_Order</w:t>
+              <w:t>Birth_Order2.0</w:t>
             </w:r>
           </w:p>
         </w:tc>
@@ -474,7 +474,7 @@
               <w:jc w:val="right"/>
             </w:pPr>
             <w:r>
-              <w:t>26,007</w:t>
+              <w:t>27,218</w:t>
             </w:r>
           </w:p>
         </w:tc>
@@ -487,7 +487,7 @@
               <w:jc w:val="right"/>
             </w:pPr>
             <w:r>
-              <w:t>8.6%</w:t>
+              <w:t>9.0%</w:t>
             </w:r>
           </w:p>
         </w:tc>
@@ -510,7 +510,7 @@
               <w:jc w:val="right"/>
             </w:pPr>
             <w:r>
-              <w:t>10</w:t>
+              <w:t>9</w:t>
             </w:r>
           </w:p>
         </w:tc>
@@ -523,7 +523,7 @@
               <w:jc w:val="right"/>
             </w:pPr>
             <w:r>
-              <w:t>275,705</w:t>
+              <w:t>274,494</w:t>
             </w:r>
           </w:p>
         </w:tc>
@@ -536,7 +536,7 @@
               <w:jc w:val="right"/>
             </w:pPr>
             <w:r>
-              <w:t>91.4%</w:t>
+              <w:t>91.0%</w:t>
             </w:r>
           </w:p>
         </w:tc>
@@ -548,7 +548,7 @@
           </w:tcPr>
           <w:p>
             <w:r>
-              <w:t>Birth_Order - Copy</w:t>
+              <w:t>Birth_Order</w:t>
             </w:r>
           </w:p>
         </w:tc>
@@ -561,7 +561,7 @@
               <w:jc w:val="right"/>
             </w:pPr>
             <w:r>
-              <w:t>26,007</w:t>
+              <w:t>27,218</w:t>
             </w:r>
           </w:p>
         </w:tc>
@@ -574,94 +574,7 @@
               <w:jc w:val="right"/>
             </w:pPr>
             <w:r>
-              <w:t>8.6%</w:t>
-            </w:r>
-          </w:p>
-        </w:tc>
-        <w:tc>
-          <w:tcPr>
-            <w:tcW w:type="dxa" w:w="1234"/>
-          </w:tcPr>
-          <w:p>
-            <w:r>
-              <w:t>float64</w:t>
-            </w:r>
-          </w:p>
-        </w:tc>
-        <w:tc>
-          <w:tcPr>
-            <w:tcW w:type="dxa" w:w="1234"/>
-          </w:tcPr>
-          <w:p>
-            <w:pPr>
-              <w:jc w:val="right"/>
-            </w:pPr>
-            <w:r>
-              <w:t>10</w:t>
-            </w:r>
-          </w:p>
-        </w:tc>
-        <w:tc>
-          <w:tcPr>
-            <w:tcW w:type="dxa" w:w="1234"/>
-          </w:tcPr>
-          <w:p>
-            <w:pPr>
-              <w:jc w:val="right"/>
-            </w:pPr>
-            <w:r>
-              <w:t>275,705</w:t>
-            </w:r>
-          </w:p>
-        </w:tc>
-        <w:tc>
-          <w:tcPr>
-            <w:tcW w:type="dxa" w:w="1234"/>
-          </w:tcPr>
-          <w:p>
-            <w:pPr>
-              <w:jc w:val="right"/>
-            </w:pPr>
-            <w:r>
-              <w:t>91.4%</w:t>
-            </w:r>
-          </w:p>
-        </w:tc>
-      </w:tr>
-      <w:tr>
-        <w:tc>
-          <w:tcPr>
-            <w:tcW w:type="dxa" w:w="1234"/>
-          </w:tcPr>
-          <w:p>
-            <w:r>
-              <w:t>Multiple_Birth_Status</w:t>
-            </w:r>
-          </w:p>
-        </w:tc>
-        <w:tc>
-          <w:tcPr>
-            <w:tcW w:type="dxa" w:w="1234"/>
-          </w:tcPr>
-          <w:p>
-            <w:pPr>
-              <w:jc w:val="right"/>
-            </w:pPr>
-            <w:r>
-              <w:t>4,163</w:t>
-            </w:r>
-          </w:p>
-        </w:tc>
-        <w:tc>
-          <w:tcPr>
-            <w:tcW w:type="dxa" w:w="1234"/>
-          </w:tcPr>
-          <w:p>
-            <w:pPr>
-              <w:jc w:val="right"/>
-            </w:pPr>
-            <w:r>
-              <w:t>1.4%</w:t>
+              <w:t>9.0%</w:t>
             </w:r>
           </w:p>
         </w:tc>
@@ -684,7 +597,7 @@
               <w:jc w:val="right"/>
             </w:pPr>
             <w:r>
-              <w:t>5</w:t>
+              <w:t>9</w:t>
             </w:r>
           </w:p>
         </w:tc>
@@ -697,7 +610,7 @@
               <w:jc w:val="right"/>
             </w:pPr>
             <w:r>
-              <w:t>297,549</w:t>
+              <w:t>274,494</w:t>
             </w:r>
           </w:p>
         </w:tc>
@@ -710,7 +623,7 @@
               <w:jc w:val="right"/>
             </w:pPr>
             <w:r>
-              <w:t>98.6%</w:t>
+              <w:t>91.0%</w:t>
             </w:r>
           </w:p>
         </w:tc>
@@ -1070,7 +983,94 @@
           </w:tcPr>
           <w:p>
             <w:r>
-              <w:t>Registered_Month2.0</w:t>
+              <w:t>Registered_Year</w:t>
+            </w:r>
+          </w:p>
+        </w:tc>
+        <w:tc>
+          <w:tcPr>
+            <w:tcW w:type="dxa" w:w="1234"/>
+          </w:tcPr>
+          <w:p>
+            <w:pPr>
+              <w:jc w:val="right"/>
+            </w:pPr>
+            <w:r>
+              <w:t>0</w:t>
+            </w:r>
+          </w:p>
+        </w:tc>
+        <w:tc>
+          <w:tcPr>
+            <w:tcW w:type="dxa" w:w="1234"/>
+          </w:tcPr>
+          <w:p>
+            <w:pPr>
+              <w:jc w:val="right"/>
+            </w:pPr>
+            <w:r>
+              <w:t>0.0%</w:t>
+            </w:r>
+          </w:p>
+        </w:tc>
+        <w:tc>
+          <w:tcPr>
+            <w:tcW w:type="dxa" w:w="1234"/>
+          </w:tcPr>
+          <w:p>
+            <w:r>
+              <w:t>int64</w:t>
+            </w:r>
+          </w:p>
+        </w:tc>
+        <w:tc>
+          <w:tcPr>
+            <w:tcW w:type="dxa" w:w="1234"/>
+          </w:tcPr>
+          <w:p>
+            <w:pPr>
+              <w:jc w:val="right"/>
+            </w:pPr>
+            <w:r>
+              <w:t>1</w:t>
+            </w:r>
+          </w:p>
+        </w:tc>
+        <w:tc>
+          <w:tcPr>
+            <w:tcW w:type="dxa" w:w="1234"/>
+          </w:tcPr>
+          <w:p>
+            <w:pPr>
+              <w:jc w:val="right"/>
+            </w:pPr>
+            <w:r>
+              <w:t>301,712</w:t>
+            </w:r>
+          </w:p>
+        </w:tc>
+        <w:tc>
+          <w:tcPr>
+            <w:tcW w:type="dxa" w:w="1234"/>
+          </w:tcPr>
+          <w:p>
+            <w:pPr>
+              <w:jc w:val="right"/>
+            </w:pPr>
+            <w:r>
+              <w:t>100.0%</w:t>
+            </w:r>
+          </w:p>
+        </w:tc>
+      </w:tr>
+      <w:tr>
+        <w:tc>
+          <w:tcPr>
+            <w:tcW w:type="dxa" w:w="1234"/>
+          </w:tcPr>
+          <w:p>
+            <w:r>
+              <w:t>Registered_Month</w:t>
             </w:r>
           </w:p>
         </w:tc>
@@ -1157,7 +1157,7 @@
           </w:tcPr>
           <w:p>
             <w:r>
-              <w:t>Registered_Year</w:t>
+              <w:t>Registered_District</w:t>
             </w:r>
           </w:p>
         </w:tc>
@@ -1193,7 +1193,7 @@
           </w:tcPr>
           <w:p>
             <w:r>
-              <w:t>int64</w:t>
+              <w:t>str</w:t>
             </w:r>
           </w:p>
         </w:tc>
@@ -1206,7 +1206,94 @@
               <w:jc w:val="right"/>
             </w:pPr>
             <w:r>
-              <w:t>1</w:t>
+              <w:t>25</w:t>
+            </w:r>
+          </w:p>
+        </w:tc>
+        <w:tc>
+          <w:tcPr>
+            <w:tcW w:type="dxa" w:w="1234"/>
+          </w:tcPr>
+          <w:p>
+            <w:pPr>
+              <w:jc w:val="right"/>
+            </w:pPr>
+            <w:r>
+              <w:t>301,712</w:t>
+            </w:r>
+          </w:p>
+        </w:tc>
+        <w:tc>
+          <w:tcPr>
+            <w:tcW w:type="dxa" w:w="1234"/>
+          </w:tcPr>
+          <w:p>
+            <w:pPr>
+              <w:jc w:val="right"/>
+            </w:pPr>
+            <w:r>
+              <w:t>100.0%</w:t>
+            </w:r>
+          </w:p>
+        </w:tc>
+      </w:tr>
+      <w:tr>
+        <w:tc>
+          <w:tcPr>
+            <w:tcW w:type="dxa" w:w="1234"/>
+          </w:tcPr>
+          <w:p>
+            <w:r>
+              <w:t>Multiple_Birth_Status</w:t>
+            </w:r>
+          </w:p>
+        </w:tc>
+        <w:tc>
+          <w:tcPr>
+            <w:tcW w:type="dxa" w:w="1234"/>
+          </w:tcPr>
+          <w:p>
+            <w:pPr>
+              <w:jc w:val="right"/>
+            </w:pPr>
+            <w:r>
+              <w:t>0</w:t>
+            </w:r>
+          </w:p>
+        </w:tc>
+        <w:tc>
+          <w:tcPr>
+            <w:tcW w:type="dxa" w:w="1234"/>
+          </w:tcPr>
+          <w:p>
+            <w:pPr>
+              <w:jc w:val="right"/>
+            </w:pPr>
+            <w:r>
+              <w:t>0.0%</w:t>
+            </w:r>
+          </w:p>
+        </w:tc>
+        <w:tc>
+          <w:tcPr>
+            <w:tcW w:type="dxa" w:w="1234"/>
+          </w:tcPr>
+          <w:p>
+            <w:r>
+              <w:t>str</w:t>
+            </w:r>
+          </w:p>
+        </w:tc>
+        <w:tc>
+          <w:tcPr>
+            <w:tcW w:type="dxa" w:w="1234"/>
+          </w:tcPr>
+          <w:p>
+            <w:pPr>
+              <w:jc w:val="right"/>
+            </w:pPr>
+            <w:r>
+              <w:t>5</w:t>
             </w:r>
           </w:p>
         </w:tc>
@@ -1418,6 +1505,93 @@
           </w:tcPr>
           <w:p>
             <w:r>
+              <w:t>Birth_Month.0</w:t>
+            </w:r>
+          </w:p>
+        </w:tc>
+        <w:tc>
+          <w:tcPr>
+            <w:tcW w:type="dxa" w:w="1234"/>
+          </w:tcPr>
+          <w:p>
+            <w:pPr>
+              <w:jc w:val="right"/>
+            </w:pPr>
+            <w:r>
+              <w:t>0</w:t>
+            </w:r>
+          </w:p>
+        </w:tc>
+        <w:tc>
+          <w:tcPr>
+            <w:tcW w:type="dxa" w:w="1234"/>
+          </w:tcPr>
+          <w:p>
+            <w:pPr>
+              <w:jc w:val="right"/>
+            </w:pPr>
+            <w:r>
+              <w:t>0.0%</w:t>
+            </w:r>
+          </w:p>
+        </w:tc>
+        <w:tc>
+          <w:tcPr>
+            <w:tcW w:type="dxa" w:w="1234"/>
+          </w:tcPr>
+          <w:p>
+            <w:r>
+              <w:t>int64</w:t>
+            </w:r>
+          </w:p>
+        </w:tc>
+        <w:tc>
+          <w:tcPr>
+            <w:tcW w:type="dxa" w:w="1234"/>
+          </w:tcPr>
+          <w:p>
+            <w:pPr>
+              <w:jc w:val="right"/>
+            </w:pPr>
+            <w:r>
+              <w:t>12</w:t>
+            </w:r>
+          </w:p>
+        </w:tc>
+        <w:tc>
+          <w:tcPr>
+            <w:tcW w:type="dxa" w:w="1234"/>
+          </w:tcPr>
+          <w:p>
+            <w:pPr>
+              <w:jc w:val="right"/>
+            </w:pPr>
+            <w:r>
+              <w:t>301,712</w:t>
+            </w:r>
+          </w:p>
+        </w:tc>
+        <w:tc>
+          <w:tcPr>
+            <w:tcW w:type="dxa" w:w="1234"/>
+          </w:tcPr>
+          <w:p>
+            <w:pPr>
+              <w:jc w:val="right"/>
+            </w:pPr>
+            <w:r>
+              <w:t>100.0%</w:t>
+            </w:r>
+          </w:p>
+        </w:tc>
+      </w:tr>
+      <w:tr>
+        <w:tc>
+          <w:tcPr>
+            <w:tcW w:type="dxa" w:w="1234"/>
+          </w:tcPr>
+          <w:p>
+            <w:r>
               <w:t>Birh_Year</w:t>
             </w:r>
           </w:p>
@@ -1505,7 +1679,7 @@
           </w:tcPr>
           <w:p>
             <w:r>
-              <w:t>Birth_Month.0</w:t>
+              <w:t>Birh_Year 2.0</w:t>
             </w:r>
           </w:p>
         </w:tc>
@@ -1554,181 +1728,7 @@
               <w:jc w:val="right"/>
             </w:pPr>
             <w:r>
-              <w:t>12</w:t>
-            </w:r>
-          </w:p>
-        </w:tc>
-        <w:tc>
-          <w:tcPr>
-            <w:tcW w:type="dxa" w:w="1234"/>
-          </w:tcPr>
-          <w:p>
-            <w:pPr>
-              <w:jc w:val="right"/>
-            </w:pPr>
-            <w:r>
-              <w:t>301,712</w:t>
-            </w:r>
-          </w:p>
-        </w:tc>
-        <w:tc>
-          <w:tcPr>
-            <w:tcW w:type="dxa" w:w="1234"/>
-          </w:tcPr>
-          <w:p>
-            <w:pPr>
-              <w:jc w:val="right"/>
-            </w:pPr>
-            <w:r>
-              <w:t>100.0%</w:t>
-            </w:r>
-          </w:p>
-        </w:tc>
-      </w:tr>
-      <w:tr>
-        <w:tc>
-          <w:tcPr>
-            <w:tcW w:type="dxa" w:w="1234"/>
-          </w:tcPr>
-          <w:p>
-            <w:r>
-              <w:t>Registered_District</w:t>
-            </w:r>
-          </w:p>
-        </w:tc>
-        <w:tc>
-          <w:tcPr>
-            <w:tcW w:type="dxa" w:w="1234"/>
-          </w:tcPr>
-          <w:p>
-            <w:pPr>
-              <w:jc w:val="right"/>
-            </w:pPr>
-            <w:r>
-              <w:t>0</w:t>
-            </w:r>
-          </w:p>
-        </w:tc>
-        <w:tc>
-          <w:tcPr>
-            <w:tcW w:type="dxa" w:w="1234"/>
-          </w:tcPr>
-          <w:p>
-            <w:pPr>
-              <w:jc w:val="right"/>
-            </w:pPr>
-            <w:r>
-              <w:t>0.0%</w:t>
-            </w:r>
-          </w:p>
-        </w:tc>
-        <w:tc>
-          <w:tcPr>
-            <w:tcW w:type="dxa" w:w="1234"/>
-          </w:tcPr>
-          <w:p>
-            <w:r>
-              <w:t>str</w:t>
-            </w:r>
-          </w:p>
-        </w:tc>
-        <w:tc>
-          <w:tcPr>
-            <w:tcW w:type="dxa" w:w="1234"/>
-          </w:tcPr>
-          <w:p>
-            <w:pPr>
-              <w:jc w:val="right"/>
-            </w:pPr>
-            <w:r>
-              <w:t>25</w:t>
-            </w:r>
-          </w:p>
-        </w:tc>
-        <w:tc>
-          <w:tcPr>
-            <w:tcW w:type="dxa" w:w="1234"/>
-          </w:tcPr>
-          <w:p>
-            <w:pPr>
-              <w:jc w:val="right"/>
-            </w:pPr>
-            <w:r>
-              <w:t>301,712</w:t>
-            </w:r>
-          </w:p>
-        </w:tc>
-        <w:tc>
-          <w:tcPr>
-            <w:tcW w:type="dxa" w:w="1234"/>
-          </w:tcPr>
-          <w:p>
-            <w:pPr>
-              <w:jc w:val="right"/>
-            </w:pPr>
-            <w:r>
-              <w:t>100.0%</w:t>
-            </w:r>
-          </w:p>
-        </w:tc>
-      </w:tr>
-      <w:tr>
-        <w:tc>
-          <w:tcPr>
-            <w:tcW w:type="dxa" w:w="1234"/>
-          </w:tcPr>
-          <w:p>
-            <w:r>
-              <w:t>Registered_Month</w:t>
-            </w:r>
-          </w:p>
-        </w:tc>
-        <w:tc>
-          <w:tcPr>
-            <w:tcW w:type="dxa" w:w="1234"/>
-          </w:tcPr>
-          <w:p>
-            <w:pPr>
-              <w:jc w:val="right"/>
-            </w:pPr>
-            <w:r>
-              <w:t>0</w:t>
-            </w:r>
-          </w:p>
-        </w:tc>
-        <w:tc>
-          <w:tcPr>
-            <w:tcW w:type="dxa" w:w="1234"/>
-          </w:tcPr>
-          <w:p>
-            <w:pPr>
-              <w:jc w:val="right"/>
-            </w:pPr>
-            <w:r>
-              <w:t>0.0%</w:t>
-            </w:r>
-          </w:p>
-        </w:tc>
-        <w:tc>
-          <w:tcPr>
-            <w:tcW w:type="dxa" w:w="1234"/>
-          </w:tcPr>
-          <w:p>
-            <w:r>
-              <w:t>str</w:t>
-            </w:r>
-          </w:p>
-        </w:tc>
-        <w:tc>
-          <w:tcPr>
-            <w:tcW w:type="dxa" w:w="1234"/>
-          </w:tcPr>
-          <w:p>
-            <w:pPr>
-              <w:jc w:val="right"/>
-            </w:pPr>
-            <w:r>
-              <w:t>12</w:t>
+              <w:t>63</w:t>
             </w:r>
           </w:p>
         </w:tc>
@@ -2103,7 +2103,7 @@
       <w:jc w:val="center"/>
     </w:pPr>
     <w:r>
-      <w:t xml:space="preserve">Missing Values Analysis | Generated: 2026-03-22 | Page </w:t>
+      <w:t xml:space="preserve">Missing Values Analysis | Generated: 2026-03-29 | Page </w:t>
     </w:r>
     <w:r>
       <w:fldChar w:fldCharType="begin"/>

</xml_diff>